<commit_message>
Fix set_para_text to strip tracked-change elements (w:ins, w:del)
Source documents had tracked changes (21 w:ins + 8 w:del per paragraph).
set_para_text only removed w:r elements, leaving tracked-change runs
intact — causing old case names to bleed through into generated docs.

Fix: clear all child elements except w:pPr before inserting placeholder
runs. Also use .//<w:r> XPath to find rPr from nested runs.
</commit_message>
<xml_diff>
--- a/poa_template_1ip_1agent.docx
+++ b/poa_template_1ip_1agent.docx
@@ -533,8 +533,6 @@
         <w:pStyle w:val="Style1"/>
         <w:jc w:val="both"/>
       </w:pPr>
-      <w:bookmarkStart w:id="1" w:name="_Hlk203135843"/>
-      <w:bookmarkEnd w:id="1"/>
       <w:r>
         <w:t xml:space="preserve">I hereby consent to giving special powers of attorney to AGENT1NAME, date of birth AGENT1DOB and AGENT1ID (a copy of AGENT1NAME’s identification is attached to this declaration).</w:t>
       </w:r>
@@ -544,8 +542,6 @@
         <w:pStyle w:val="Style1"/>
         <w:jc w:val="both"/>
       </w:pPr>
-      <w:bookmarkStart w:id="2" w:name="_Hlk203136361"/>
-      <w:bookmarkEnd w:id="2"/>
       <w:r>
         <w:t xml:space="preserve">I understand and agree that AGENT1NAME is to be provided a wristband, allowing access to the nursery (including the Neo-Natal Intensive Care Unit “NICU”) by any physician and/or medical facility and/or medical personnel providing post-natal or well care to the child born to me by my gestational surrogate.</w:t>
       </w:r>

</xml_diff>

<commit_message>
Fix 1ip/1agent signature section: remove double-spacing and blank page
Para 21 (witness clause) had w:spacing line=480 inherited from the
Shi & Aispuro source document, making it stand out as double-spaced.
Para 25 had an explicit w:br type=page creating a blank page between
the signature block and the notary acknowledgment section.

Both fixes applied to the committed template and to prep_all_templates.py
so they survive future regeneration from source.
</commit_message>
<xml_diff>
--- a/poa_template_1ip_1agent.docx
+++ b/poa_template_1ip_1agent.docx
@@ -697,7 +697,6 @@
           <w:tab w:val="left" w:pos="3886"/>
           <w:tab w:val="left" w:pos="7470"/>
         </w:tabs>
-        <w:spacing w:line="480" w:lineRule="auto"/>
         <w:ind w:firstLine="0"/>
         <w:jc w:val="both"/>
       </w:pPr>
@@ -792,13 +791,6 @@
           <w:lang w:eastAsia="zh-CN"/>
         </w:rPr>
       </w:pPr>
-      <w:r>
-        <w:rPr>
-          <w:rFonts w:eastAsiaTheme="minorEastAsia"/>
-          <w:lang w:eastAsia="zh-CN"/>
-        </w:rPr>
-        <w:br w:type="page"/>
-      </w:r>
     </w:p>
     <w:p>
       <w:pPr>

</xml_diff>

<commit_message>
Fix photo slot ordering, signature line, and label spacing for all 6 templates
- Correct _V2_PHOTO_SLOTS: agents first, then IP2 (Intended Mother), then IP1
  (Intended Father) — fixes passport photos going into landscape ID frames
  and agent IDs going into portrait passport frames, eliminating compression
- Add per-blip indexing (_find_image_blips / _replace_image_blip) so 1ip_3agent
  can independently replace all 3 agent photos that share one paragraph
- Fix JADE signature line (2ip_1agent para 22): add 5 underlined tab runs to
  match KKKO's visible line structure (6 plain + 5 underlined tabs)
- Remove blank paragraphs between each photo and its label in all 6 templates
  (21–47 blanks each), so labels now appear immediately below their photo
</commit_message>
<xml_diff>
--- a/poa_template_1ip_1agent.docx
+++ b/poa_template_1ip_1agent.docx
@@ -1472,125 +1472,6 @@
         </w:drawing>
       </w:r>
     </w:p>
-    <w:p/>
-    <w:p/>
-    <w:p>
-      <w:pPr>
-        <w:spacing w:line="240" w:lineRule="auto"/>
-        <w:rPr>
-          <w:noProof/>
-        </w:rPr>
-      </w:pPr>
-    </w:p>
-    <w:p>
-      <w:pPr>
-        <w:spacing w:line="240" w:lineRule="auto"/>
-        <w:rPr>
-          <w:noProof/>
-        </w:rPr>
-      </w:pPr>
-    </w:p>
-    <w:p>
-      <w:pPr>
-        <w:spacing w:line="240" w:lineRule="auto"/>
-      </w:pPr>
-    </w:p>
-    <w:p>
-      <w:pPr>
-        <w:spacing w:line="240" w:lineRule="auto"/>
-        <w:rPr>
-          <w:noProof/>
-        </w:rPr>
-      </w:pPr>
-    </w:p>
-    <w:p>
-      <w:pPr>
-        <w:spacing w:line="240" w:lineRule="auto"/>
-        <w:ind w:firstLine="720"/>
-        <w:rPr>
-          <w:noProof/>
-          <w:sz w:val="24"/>
-          <w:szCs w:val="24"/>
-        </w:rPr>
-      </w:pPr>
-    </w:p>
-    <w:p>
-      <w:pPr>
-        <w:spacing w:line="240" w:lineRule="auto"/>
-        <w:ind w:firstLine="720"/>
-        <w:rPr>
-          <w:noProof/>
-          <w:sz w:val="24"/>
-          <w:szCs w:val="24"/>
-        </w:rPr>
-      </w:pPr>
-    </w:p>
-    <w:p>
-      <w:pPr>
-        <w:spacing w:line="240" w:lineRule="auto"/>
-        <w:ind w:firstLine="720"/>
-        <w:rPr>
-          <w:noProof/>
-          <w:sz w:val="24"/>
-          <w:szCs w:val="24"/>
-        </w:rPr>
-      </w:pPr>
-    </w:p>
-    <w:p>
-      <w:pPr>
-        <w:spacing w:line="240" w:lineRule="auto"/>
-        <w:ind w:firstLine="720"/>
-        <w:rPr>
-          <w:noProof/>
-          <w:sz w:val="24"/>
-          <w:szCs w:val="24"/>
-        </w:rPr>
-      </w:pPr>
-    </w:p>
-    <w:p>
-      <w:pPr>
-        <w:spacing w:line="240" w:lineRule="auto"/>
-        <w:ind w:firstLine="720"/>
-        <w:rPr>
-          <w:noProof/>
-          <w:sz w:val="24"/>
-          <w:szCs w:val="24"/>
-        </w:rPr>
-      </w:pPr>
-    </w:p>
-    <w:p>
-      <w:pPr>
-        <w:spacing w:line="240" w:lineRule="auto"/>
-        <w:ind w:firstLine="720"/>
-        <w:rPr>
-          <w:noProof/>
-          <w:sz w:val="24"/>
-          <w:szCs w:val="24"/>
-        </w:rPr>
-      </w:pPr>
-    </w:p>
-    <w:p>
-      <w:pPr>
-        <w:spacing w:line="240" w:lineRule="auto"/>
-        <w:ind w:firstLine="720"/>
-        <w:rPr>
-          <w:noProof/>
-          <w:sz w:val="24"/>
-          <w:szCs w:val="24"/>
-        </w:rPr>
-      </w:pPr>
-    </w:p>
-    <w:p>
-      <w:pPr>
-        <w:spacing w:line="240" w:lineRule="auto"/>
-        <w:ind w:firstLine="720"/>
-        <w:rPr>
-          <w:noProof/>
-          <w:sz w:val="24"/>
-          <w:szCs w:val="24"/>
-        </w:rPr>
-      </w:pPr>
-    </w:p>
     <w:p>
       <w:pPr>
         <w:spacing w:line="240" w:lineRule="auto"/>
@@ -1703,234 +1584,6 @@
           </wp:anchor>
         </w:drawing>
       </w:r>
-    </w:p>
-    <w:p>
-      <w:pPr>
-        <w:spacing w:line="240" w:lineRule="auto"/>
-        <w:ind w:firstLine="720"/>
-        <w:rPr>
-          <w:noProof/>
-          <w:sz w:val="24"/>
-          <w:szCs w:val="24"/>
-          <w:lang w:eastAsia="zh-CN"/>
-        </w:rPr>
-      </w:pPr>
-    </w:p>
-    <w:p>
-      <w:pPr>
-        <w:spacing w:line="240" w:lineRule="auto"/>
-        <w:ind w:firstLine="720"/>
-        <w:rPr>
-          <w:noProof/>
-          <w:sz w:val="24"/>
-          <w:szCs w:val="24"/>
-          <w:lang w:eastAsia="zh-CN"/>
-        </w:rPr>
-      </w:pPr>
-    </w:p>
-    <w:p>
-      <w:pPr>
-        <w:spacing w:line="240" w:lineRule="auto"/>
-        <w:ind w:firstLine="720"/>
-        <w:rPr>
-          <w:noProof/>
-          <w:sz w:val="24"/>
-          <w:szCs w:val="24"/>
-          <w:lang w:eastAsia="zh-CN"/>
-        </w:rPr>
-      </w:pPr>
-    </w:p>
-    <w:p>
-      <w:pPr>
-        <w:spacing w:line="240" w:lineRule="auto"/>
-        <w:ind w:firstLine="720"/>
-        <w:rPr>
-          <w:noProof/>
-          <w:sz w:val="24"/>
-          <w:szCs w:val="24"/>
-          <w:lang w:eastAsia="zh-CN"/>
-        </w:rPr>
-      </w:pPr>
-    </w:p>
-    <w:p>
-      <w:pPr>
-        <w:spacing w:line="240" w:lineRule="auto"/>
-        <w:ind w:firstLine="720"/>
-      </w:pPr>
-    </w:p>
-    <w:p>
-      <w:pPr>
-        <w:spacing w:line="240" w:lineRule="auto"/>
-        <w:ind w:firstLine="720"/>
-        <w:rPr>
-          <w:noProof/>
-          <w:sz w:val="24"/>
-          <w:szCs w:val="24"/>
-          <w:lang w:eastAsia="zh-CN"/>
-        </w:rPr>
-      </w:pPr>
-    </w:p>
-    <w:p>
-      <w:pPr>
-        <w:spacing w:line="240" w:lineRule="auto"/>
-        <w:ind w:firstLine="720"/>
-        <w:rPr>
-          <w:noProof/>
-          <w:sz w:val="24"/>
-          <w:szCs w:val="24"/>
-          <w:lang w:eastAsia="zh-CN"/>
-        </w:rPr>
-      </w:pPr>
-    </w:p>
-    <w:p>
-      <w:pPr>
-        <w:spacing w:line="240" w:lineRule="auto"/>
-        <w:rPr>
-          <w:noProof/>
-          <w:sz w:val="24"/>
-          <w:szCs w:val="24"/>
-          <w:lang w:eastAsia="zh-CN"/>
-        </w:rPr>
-      </w:pPr>
-    </w:p>
-    <w:p>
-      <w:pPr>
-        <w:spacing w:line="240" w:lineRule="auto"/>
-        <w:ind w:firstLine="720"/>
-        <w:rPr>
-          <w:noProof/>
-          <w:sz w:val="24"/>
-          <w:szCs w:val="24"/>
-          <w:lang w:eastAsia="zh-CN"/>
-        </w:rPr>
-      </w:pPr>
-    </w:p>
-    <w:p>
-      <w:pPr>
-        <w:spacing w:line="240" w:lineRule="auto"/>
-      </w:pPr>
-    </w:p>
-    <w:p>
-      <w:pPr>
-        <w:spacing w:line="240" w:lineRule="auto"/>
-        <w:ind w:firstLine="720"/>
-        <w:rPr>
-          <w:noProof/>
-          <w:sz w:val="24"/>
-          <w:szCs w:val="24"/>
-          <w:lang w:eastAsia="zh-CN"/>
-        </w:rPr>
-      </w:pPr>
-    </w:p>
-    <w:p>
-      <w:pPr>
-        <w:spacing w:line="240" w:lineRule="auto"/>
-      </w:pPr>
-    </w:p>
-    <w:p>
-      <w:pPr>
-        <w:spacing w:line="240" w:lineRule="auto"/>
-      </w:pPr>
-    </w:p>
-    <w:p>
-      <w:pPr>
-        <w:spacing w:line="240" w:lineRule="auto"/>
-      </w:pPr>
-    </w:p>
-    <w:p>
-      <w:pPr>
-        <w:spacing w:line="240" w:lineRule="auto"/>
-      </w:pPr>
-    </w:p>
-    <w:p>
-      <w:pPr>
-        <w:spacing w:line="240" w:lineRule="auto"/>
-      </w:pPr>
-    </w:p>
-    <w:p>
-      <w:pPr>
-        <w:spacing w:line="240" w:lineRule="auto"/>
-      </w:pPr>
-    </w:p>
-    <w:p>
-      <w:pPr>
-        <w:spacing w:line="240" w:lineRule="auto"/>
-      </w:pPr>
-    </w:p>
-    <w:p>
-      <w:pPr>
-        <w:spacing w:line="240" w:lineRule="auto"/>
-      </w:pPr>
-    </w:p>
-    <w:p>
-      <w:pPr>
-        <w:spacing w:line="240" w:lineRule="auto"/>
-      </w:pPr>
-    </w:p>
-    <w:p>
-      <w:pPr>
-        <w:spacing w:line="240" w:lineRule="auto"/>
-      </w:pPr>
-    </w:p>
-    <w:p>
-      <w:pPr>
-        <w:spacing w:line="240" w:lineRule="auto"/>
-      </w:pPr>
-    </w:p>
-    <w:p>
-      <w:pPr>
-        <w:spacing w:line="240" w:lineRule="auto"/>
-      </w:pPr>
-    </w:p>
-    <w:p>
-      <w:pPr>
-        <w:spacing w:line="240" w:lineRule="auto"/>
-      </w:pPr>
-    </w:p>
-    <w:p>
-      <w:pPr>
-        <w:spacing w:line="240" w:lineRule="auto"/>
-      </w:pPr>
-    </w:p>
-    <w:p>
-      <w:pPr>
-        <w:spacing w:line="240" w:lineRule="auto"/>
-      </w:pPr>
-    </w:p>
-    <w:p>
-      <w:pPr>
-        <w:spacing w:line="240" w:lineRule="auto"/>
-      </w:pPr>
-    </w:p>
-    <w:p>
-      <w:pPr>
-        <w:spacing w:line="240" w:lineRule="auto"/>
-      </w:pPr>
-    </w:p>
-    <w:p>
-      <w:pPr>
-        <w:spacing w:line="240" w:lineRule="auto"/>
-      </w:pPr>
-    </w:p>
-    <w:p>
-      <w:pPr>
-        <w:spacing w:line="240" w:lineRule="auto"/>
-      </w:pPr>
-    </w:p>
-    <w:p>
-      <w:pPr>
-        <w:spacing w:line="240" w:lineRule="auto"/>
-      </w:pPr>
-    </w:p>
-    <w:p>
-      <w:pPr>
-        <w:spacing w:line="240" w:lineRule="auto"/>
-      </w:pPr>
-    </w:p>
-    <w:p>
-      <w:pPr>
-        <w:spacing w:line="240" w:lineRule="auto"/>
-      </w:pPr>
     </w:p>
     <w:p>
       <w:pPr>

</xml_diff>

<commit_message>
Fix floating images and photo compression in all templates
- Convert all wp:anchor (floating) images to wp:inline across all 6 templates
  so paragraph text flows below photos instead of wrapping beside them
- Add Pillow to requirements.txt and update _replace_image_blip to resize
  wp:extent to match each uploaded photo's natural aspect ratio, eliminating
  stretch/compression when photo dimensions differ from the template frame
</commit_message>
<xml_diff>
--- a/poa_template_1ip_1agent.docx
+++ b/poa_template_1ip_1agent.docx
@@ -841,17 +841,9 @@
         <mc:AlternateContent>
           <mc:Choice Requires="wps">
             <w:drawing>
-              <wp:anchor distT="45720" distB="45720" distL="114300" distR="114300" simplePos="0" relativeHeight="251658240" behindDoc="0" locked="0" layoutInCell="1" allowOverlap="1" wp14:anchorId="38DA0D5C" wp14:editId="61352CF6">
-                <wp:simplePos x="0" y="0"/>
-                <wp:positionH relativeFrom="margin">
-                  <wp:align>center</wp:align>
-                </wp:positionH>
-                <wp:positionV relativeFrom="paragraph">
-                  <wp:posOffset>311150</wp:posOffset>
-                </wp:positionV>
+              <wp:inline distT="0" distB="0" distL="114300" distR="114300">
                 <wp:extent cx="5699760" cy="769620"/>
                 <wp:effectExtent l="9525" t="6350" r="5715" b="8255"/>
-                <wp:wrapSquare wrapText="bothSides"/>
                 <wp:docPr id="139423568" name="Text Box 5"/>
                 <wp:cNvGraphicFramePr>
                   <a:graphicFrameLocks xmlns:a="http://schemas.openxmlformats.org/drawingml/2006/main"/>
@@ -907,13 +899,7 @@
                     </wps:wsp>
                   </a:graphicData>
                 </a:graphic>
-                <wp14:sizeRelH relativeFrom="margin">
-                  <wp14:pctWidth>0</wp14:pctWidth>
-                </wp14:sizeRelH>
-                <wp14:sizeRelV relativeFrom="margin">
-                  <wp14:pctHeight>20000</wp14:pctHeight>
-                </wp14:sizeRelV>
-              </wp:anchor>
+              </wp:inline>
             </w:drawing>
           </mc:Choice>
           <mc:Fallback>
@@ -1422,17 +1408,9 @@
         </w:rPr>
         <w:lastRenderedPageBreak/>
         <w:drawing>
-          <wp:anchor distT="0" distB="0" distL="114300" distR="114300" simplePos="0" relativeHeight="251658242" behindDoc="0" locked="0" layoutInCell="1" allowOverlap="1" wp14:anchorId="674738F6" wp14:editId="7867F415">
-            <wp:simplePos x="0" y="0"/>
-            <wp:positionH relativeFrom="column">
-              <wp:posOffset>245660</wp:posOffset>
-            </wp:positionH>
-            <wp:positionV relativeFrom="paragraph">
-              <wp:posOffset>199</wp:posOffset>
-            </wp:positionV>
+          <wp:inline distT="0" distB="0" distL="114300" distR="114300">
             <wp:extent cx="3714750" cy="2495550"/>
             <wp:effectExtent l="0" t="0" r="0" b="0"/>
-            <wp:wrapSquare wrapText="bothSides"/>
             <wp:docPr id="696357762" name="drawing" descr="A person's face on a passport&#10;&#10;AI-generated content may be incorrect."/>
             <wp:cNvGraphicFramePr>
               <a:graphicFrameLocks xmlns:a="http://schemas.openxmlformats.org/drawingml/2006/main" noChangeAspect="1"/>
@@ -1468,7 +1446,7 @@
                 </pic:pic>
               </a:graphicData>
             </a:graphic>
-          </wp:anchor>
+          </wp:inline>
         </w:drawing>
       </w:r>
     </w:p>
@@ -1529,17 +1507,9 @@
           <w:noProof/>
         </w:rPr>
         <w:drawing>
-          <wp:anchor distT="0" distB="0" distL="114300" distR="114300" simplePos="0" relativeHeight="251658241" behindDoc="1" locked="0" layoutInCell="1" allowOverlap="1" wp14:anchorId="57BA200F" wp14:editId="67375C71">
-            <wp:simplePos x="0" y="0"/>
-            <wp:positionH relativeFrom="column">
-              <wp:posOffset>258445</wp:posOffset>
-            </wp:positionH>
-            <wp:positionV relativeFrom="paragraph">
-              <wp:posOffset>7620</wp:posOffset>
-            </wp:positionV>
+          <wp:inline distT="0" distB="0" distL="114300" distR="114300">
             <wp:extent cx="3589020" cy="4790440"/>
             <wp:effectExtent l="0" t="0" r="0" b="0"/>
-            <wp:wrapNone/>
             <wp:docPr id="1057359869" name="drawing"/>
             <wp:cNvGraphicFramePr>
               <a:graphicFrameLocks xmlns:a="http://schemas.openxmlformats.org/drawingml/2006/main" noChangeAspect="1"/>
@@ -1575,13 +1545,7 @@
                 </pic:pic>
               </a:graphicData>
             </a:graphic>
-            <wp14:sizeRelH relativeFrom="page">
-              <wp14:pctWidth>0</wp14:pctWidth>
-            </wp14:sizeRelH>
-            <wp14:sizeRelV relativeFrom="page">
-              <wp14:pctHeight>0</wp14:pctHeight>
-            </wp14:sizeRelV>
-          </wp:anchor>
+          </wp:inline>
         </w:drawing>
       </w:r>
     </w:p>

</xml_diff>

<commit_message>
Add explicit page breaks before each attachment in all 6 templates
Replace runs of blank paragraphs before each inline image with a single
page-break paragraph so every attachment (photo + label) lands on its
own page instead of flowing onto the notary page.
</commit_message>
<xml_diff>
--- a/poa_template_1ip_1agent.docx
+++ b/poa_template_1ip_1agent.docx
@@ -1376,24 +1376,9 @@
           <w:sz w:val="24"/>
         </w:rPr>
       </w:pPr>
-    </w:p>
-    <w:p>
-      <w:pPr>
-        <w:pStyle w:val="BodyText"/>
-        <w:ind w:left="3600"/>
-        <w:rPr>
-          <w:rFonts w:eastAsia="Times New Roman"/>
-          <w:szCs w:val="24"/>
-        </w:rPr>
-      </w:pPr>
-    </w:p>
-    <w:p>
-      <w:pPr>
-        <w:spacing w:line="240" w:lineRule="auto"/>
-        <w:rPr>
-          <w:noProof/>
-        </w:rPr>
-      </w:pPr>
+      <w:r>
+        <w:br w:type="page"/>
+      </w:r>
     </w:p>
     <w:p>
       <w:pPr>
@@ -1490,6 +1475,9 @@
           <w:lang w:eastAsia="zh-CN"/>
         </w:rPr>
       </w:pPr>
+      <w:r>
+        <w:br w:type="page"/>
+      </w:r>
     </w:p>
     <w:p>
       <w:pPr>

</xml_diff>

<commit_message>
Fix photo display: seek(0) before read, targeted inline conversion, page breaks
- app.py: add f.seek(0) before f.read() for IP and agent photo uploads
  (Streamlit UploadedFile position was not reset between reruns, causing
  empty bytes on every Generate click after the first)
- Templates: revert the all-drawings anchor→inline conversion that accidentally
  included the notary certificate text box (a floating shape), which broke
  the main/notary page layout
- Templates: instead convert ONLY the attachment-section photo anchors to
  inline (drawings that contain a:blip), leaving text boxes as floating anchors
- Templates: add explicit page break paragraph before each inline photo so
  every attachment lands on its own page with its label immediately below
</commit_message>
<xml_diff>
--- a/poa_template_1ip_1agent.docx
+++ b/poa_template_1ip_1agent.docx
@@ -841,9 +841,17 @@
         <mc:AlternateContent>
           <mc:Choice Requires="wps">
             <w:drawing>
-              <wp:inline distT="0" distB="0" distL="114300" distR="114300">
+              <wp:anchor distT="45720" distB="45720" distL="114300" distR="114300" simplePos="0" relativeHeight="251658240" behindDoc="0" locked="0" layoutInCell="1" allowOverlap="1" wp14:anchorId="38DA0D5C" wp14:editId="61352CF6">
+                <wp:simplePos x="0" y="0"/>
+                <wp:positionH relativeFrom="margin">
+                  <wp:align>center</wp:align>
+                </wp:positionH>
+                <wp:positionV relativeFrom="paragraph">
+                  <wp:posOffset>311150</wp:posOffset>
+                </wp:positionV>
                 <wp:extent cx="5699760" cy="769620"/>
                 <wp:effectExtent l="9525" t="6350" r="5715" b="8255"/>
+                <wp:wrapSquare wrapText="bothSides"/>
                 <wp:docPr id="139423568" name="Text Box 5"/>
                 <wp:cNvGraphicFramePr>
                   <a:graphicFrameLocks xmlns:a="http://schemas.openxmlformats.org/drawingml/2006/main"/>
@@ -899,7 +907,13 @@
                     </wps:wsp>
                   </a:graphicData>
                 </a:graphic>
-              </wp:inline>
+                <wp14:sizeRelH relativeFrom="margin">
+                  <wp14:pctWidth>0</wp14:pctWidth>
+                </wp14:sizeRelH>
+                <wp14:sizeRelV relativeFrom="margin">
+                  <wp14:pctHeight>20000</wp14:pctHeight>
+                </wp14:sizeRelV>
+              </wp:anchor>
             </w:drawing>
           </mc:Choice>
           <mc:Fallback>

</xml_diff>

<commit_message>
Revert to original floating-image layout; fix JADE sig line; remove PIL resize code
- Restore all 6 templates to 0b4c78f state (floating anchor images, original
  blank-paragraph spacing) — the layout that was confirmed working for photos
- Fix JADE signature line in all 2ip templates: add 5 underlined tab runs
  (para 22 in 2ip_1agent, para 25 in 2ip_2agent/3agent) to match KKKO line
- Remove PIL aspect ratio code from _replace_image_blip — the extent resize
  was squashing images to near-zero height when photo orientation differed
  from the template frame; simple blob-only swap is sufficient
- f.seek(0) before f.read() fix was already in place from previous commit
</commit_message>
<xml_diff>
--- a/poa_template_1ip_1agent.docx
+++ b/poa_template_1ip_1agent.docx
@@ -1390,9 +1390,24 @@
           <w:sz w:val="24"/>
         </w:rPr>
       </w:pPr>
-      <w:r>
-        <w:br w:type="page"/>
-      </w:r>
+    </w:p>
+    <w:p>
+      <w:pPr>
+        <w:pStyle w:val="BodyText"/>
+        <w:ind w:left="3600"/>
+        <w:rPr>
+          <w:rFonts w:eastAsia="Times New Roman"/>
+          <w:szCs w:val="24"/>
+        </w:rPr>
+      </w:pPr>
+    </w:p>
+    <w:p>
+      <w:pPr>
+        <w:spacing w:line="240" w:lineRule="auto"/>
+        <w:rPr>
+          <w:noProof/>
+        </w:rPr>
+      </w:pPr>
     </w:p>
     <w:p>
       <w:pPr>
@@ -1407,9 +1422,17 @@
         </w:rPr>
         <w:lastRenderedPageBreak/>
         <w:drawing>
-          <wp:inline distT="0" distB="0" distL="114300" distR="114300">
+          <wp:anchor distT="0" distB="0" distL="114300" distR="114300" simplePos="0" relativeHeight="251658242" behindDoc="0" locked="0" layoutInCell="1" allowOverlap="1" wp14:anchorId="674738F6" wp14:editId="7867F415">
+            <wp:simplePos x="0" y="0"/>
+            <wp:positionH relativeFrom="column">
+              <wp:posOffset>245660</wp:posOffset>
+            </wp:positionH>
+            <wp:positionV relativeFrom="paragraph">
+              <wp:posOffset>199</wp:posOffset>
+            </wp:positionV>
             <wp:extent cx="3714750" cy="2495550"/>
             <wp:effectExtent l="0" t="0" r="0" b="0"/>
+            <wp:wrapSquare wrapText="bothSides"/>
             <wp:docPr id="696357762" name="drawing" descr="A person's face on a passport&#10;&#10;AI-generated content may be incorrect."/>
             <wp:cNvGraphicFramePr>
               <a:graphicFrameLocks xmlns:a="http://schemas.openxmlformats.org/drawingml/2006/main" noChangeAspect="1"/>
@@ -1445,9 +1468,128 @@
                 </pic:pic>
               </a:graphicData>
             </a:graphic>
-          </wp:inline>
+          </wp:anchor>
         </w:drawing>
       </w:r>
+    </w:p>
+    <w:p/>
+    <w:p/>
+    <w:p>
+      <w:pPr>
+        <w:spacing w:line="240" w:lineRule="auto"/>
+        <w:rPr>
+          <w:noProof/>
+        </w:rPr>
+      </w:pPr>
+    </w:p>
+    <w:p>
+      <w:pPr>
+        <w:spacing w:line="240" w:lineRule="auto"/>
+        <w:rPr>
+          <w:noProof/>
+        </w:rPr>
+      </w:pPr>
+    </w:p>
+    <w:p>
+      <w:pPr>
+        <w:spacing w:line="240" w:lineRule="auto"/>
+      </w:pPr>
+    </w:p>
+    <w:p>
+      <w:pPr>
+        <w:spacing w:line="240" w:lineRule="auto"/>
+        <w:rPr>
+          <w:noProof/>
+        </w:rPr>
+      </w:pPr>
+    </w:p>
+    <w:p>
+      <w:pPr>
+        <w:spacing w:line="240" w:lineRule="auto"/>
+        <w:ind w:firstLine="720"/>
+        <w:rPr>
+          <w:noProof/>
+          <w:sz w:val="24"/>
+          <w:szCs w:val="24"/>
+        </w:rPr>
+      </w:pPr>
+    </w:p>
+    <w:p>
+      <w:pPr>
+        <w:spacing w:line="240" w:lineRule="auto"/>
+        <w:ind w:firstLine="720"/>
+        <w:rPr>
+          <w:noProof/>
+          <w:sz w:val="24"/>
+          <w:szCs w:val="24"/>
+        </w:rPr>
+      </w:pPr>
+    </w:p>
+    <w:p>
+      <w:pPr>
+        <w:spacing w:line="240" w:lineRule="auto"/>
+        <w:ind w:firstLine="720"/>
+        <w:rPr>
+          <w:noProof/>
+          <w:sz w:val="24"/>
+          <w:szCs w:val="24"/>
+        </w:rPr>
+      </w:pPr>
+    </w:p>
+    <w:p>
+      <w:pPr>
+        <w:spacing w:line="240" w:lineRule="auto"/>
+        <w:ind w:firstLine="720"/>
+        <w:rPr>
+          <w:noProof/>
+          <w:sz w:val="24"/>
+          <w:szCs w:val="24"/>
+        </w:rPr>
+      </w:pPr>
+    </w:p>
+    <w:p>
+      <w:pPr>
+        <w:spacing w:line="240" w:lineRule="auto"/>
+        <w:ind w:firstLine="720"/>
+        <w:rPr>
+          <w:noProof/>
+          <w:sz w:val="24"/>
+          <w:szCs w:val="24"/>
+        </w:rPr>
+      </w:pPr>
+    </w:p>
+    <w:p>
+      <w:pPr>
+        <w:spacing w:line="240" w:lineRule="auto"/>
+        <w:ind w:firstLine="720"/>
+        <w:rPr>
+          <w:noProof/>
+          <w:sz w:val="24"/>
+          <w:szCs w:val="24"/>
+        </w:rPr>
+      </w:pPr>
+    </w:p>
+    <w:p>
+      <w:pPr>
+        <w:spacing w:line="240" w:lineRule="auto"/>
+        <w:ind w:firstLine="720"/>
+        <w:rPr>
+          <w:noProof/>
+          <w:sz w:val="24"/>
+          <w:szCs w:val="24"/>
+        </w:rPr>
+      </w:pPr>
+    </w:p>
+    <w:p>
+      <w:pPr>
+        <w:spacing w:line="240" w:lineRule="auto"/>
+        <w:ind w:firstLine="720"/>
+        <w:rPr>
+          <w:noProof/>
+          <w:sz w:val="24"/>
+          <w:szCs w:val="24"/>
+        </w:rPr>
+      </w:pPr>
     </w:p>
     <w:p>
       <w:pPr>
@@ -1489,9 +1631,6 @@
           <w:lang w:eastAsia="zh-CN"/>
         </w:rPr>
       </w:pPr>
-      <w:r>
-        <w:br w:type="page"/>
-      </w:r>
     </w:p>
     <w:p>
       <w:pPr>
@@ -1509,9 +1648,17 @@
           <w:noProof/>
         </w:rPr>
         <w:drawing>
-          <wp:inline distT="0" distB="0" distL="114300" distR="114300">
+          <wp:anchor distT="0" distB="0" distL="114300" distR="114300" simplePos="0" relativeHeight="251658241" behindDoc="1" locked="0" layoutInCell="1" allowOverlap="1" wp14:anchorId="57BA200F" wp14:editId="67375C71">
+            <wp:simplePos x="0" y="0"/>
+            <wp:positionH relativeFrom="column">
+              <wp:posOffset>258445</wp:posOffset>
+            </wp:positionH>
+            <wp:positionV relativeFrom="paragraph">
+              <wp:posOffset>7620</wp:posOffset>
+            </wp:positionV>
             <wp:extent cx="3589020" cy="4790440"/>
             <wp:effectExtent l="0" t="0" r="0" b="0"/>
+            <wp:wrapNone/>
             <wp:docPr id="1057359869" name="drawing"/>
             <wp:cNvGraphicFramePr>
               <a:graphicFrameLocks xmlns:a="http://schemas.openxmlformats.org/drawingml/2006/main" noChangeAspect="1"/>
@@ -1547,9 +1694,243 @@
                 </pic:pic>
               </a:graphicData>
             </a:graphic>
-          </wp:inline>
+            <wp14:sizeRelH relativeFrom="page">
+              <wp14:pctWidth>0</wp14:pctWidth>
+            </wp14:sizeRelH>
+            <wp14:sizeRelV relativeFrom="page">
+              <wp14:pctHeight>0</wp14:pctHeight>
+            </wp14:sizeRelV>
+          </wp:anchor>
         </w:drawing>
       </w:r>
+    </w:p>
+    <w:p>
+      <w:pPr>
+        <w:spacing w:line="240" w:lineRule="auto"/>
+        <w:ind w:firstLine="720"/>
+        <w:rPr>
+          <w:noProof/>
+          <w:sz w:val="24"/>
+          <w:szCs w:val="24"/>
+          <w:lang w:eastAsia="zh-CN"/>
+        </w:rPr>
+      </w:pPr>
+    </w:p>
+    <w:p>
+      <w:pPr>
+        <w:spacing w:line="240" w:lineRule="auto"/>
+        <w:ind w:firstLine="720"/>
+        <w:rPr>
+          <w:noProof/>
+          <w:sz w:val="24"/>
+          <w:szCs w:val="24"/>
+          <w:lang w:eastAsia="zh-CN"/>
+        </w:rPr>
+      </w:pPr>
+    </w:p>
+    <w:p>
+      <w:pPr>
+        <w:spacing w:line="240" w:lineRule="auto"/>
+        <w:ind w:firstLine="720"/>
+        <w:rPr>
+          <w:noProof/>
+          <w:sz w:val="24"/>
+          <w:szCs w:val="24"/>
+          <w:lang w:eastAsia="zh-CN"/>
+        </w:rPr>
+      </w:pPr>
+    </w:p>
+    <w:p>
+      <w:pPr>
+        <w:spacing w:line="240" w:lineRule="auto"/>
+        <w:ind w:firstLine="720"/>
+        <w:rPr>
+          <w:noProof/>
+          <w:sz w:val="24"/>
+          <w:szCs w:val="24"/>
+          <w:lang w:eastAsia="zh-CN"/>
+        </w:rPr>
+      </w:pPr>
+    </w:p>
+    <w:p>
+      <w:pPr>
+        <w:spacing w:line="240" w:lineRule="auto"/>
+        <w:ind w:firstLine="720"/>
+      </w:pPr>
+    </w:p>
+    <w:p>
+      <w:pPr>
+        <w:spacing w:line="240" w:lineRule="auto"/>
+        <w:ind w:firstLine="720"/>
+        <w:rPr>
+          <w:noProof/>
+          <w:sz w:val="24"/>
+          <w:szCs w:val="24"/>
+          <w:lang w:eastAsia="zh-CN"/>
+        </w:rPr>
+      </w:pPr>
+    </w:p>
+    <w:p>
+      <w:pPr>
+        <w:spacing w:line="240" w:lineRule="auto"/>
+        <w:ind w:firstLine="720"/>
+        <w:rPr>
+          <w:noProof/>
+          <w:sz w:val="24"/>
+          <w:szCs w:val="24"/>
+          <w:lang w:eastAsia="zh-CN"/>
+        </w:rPr>
+      </w:pPr>
+    </w:p>
+    <w:p>
+      <w:pPr>
+        <w:spacing w:line="240" w:lineRule="auto"/>
+        <w:rPr>
+          <w:noProof/>
+          <w:sz w:val="24"/>
+          <w:szCs w:val="24"/>
+          <w:lang w:eastAsia="zh-CN"/>
+        </w:rPr>
+      </w:pPr>
+    </w:p>
+    <w:p>
+      <w:pPr>
+        <w:spacing w:line="240" w:lineRule="auto"/>
+        <w:ind w:firstLine="720"/>
+        <w:rPr>
+          <w:noProof/>
+          <w:sz w:val="24"/>
+          <w:szCs w:val="24"/>
+          <w:lang w:eastAsia="zh-CN"/>
+        </w:rPr>
+      </w:pPr>
+    </w:p>
+    <w:p>
+      <w:pPr>
+        <w:spacing w:line="240" w:lineRule="auto"/>
+      </w:pPr>
+    </w:p>
+    <w:p>
+      <w:pPr>
+        <w:spacing w:line="240" w:lineRule="auto"/>
+        <w:ind w:firstLine="720"/>
+        <w:rPr>
+          <w:noProof/>
+          <w:sz w:val="24"/>
+          <w:szCs w:val="24"/>
+          <w:lang w:eastAsia="zh-CN"/>
+        </w:rPr>
+      </w:pPr>
+    </w:p>
+    <w:p>
+      <w:pPr>
+        <w:spacing w:line="240" w:lineRule="auto"/>
+      </w:pPr>
+    </w:p>
+    <w:p>
+      <w:pPr>
+        <w:spacing w:line="240" w:lineRule="auto"/>
+      </w:pPr>
+    </w:p>
+    <w:p>
+      <w:pPr>
+        <w:spacing w:line="240" w:lineRule="auto"/>
+      </w:pPr>
+    </w:p>
+    <w:p>
+      <w:pPr>
+        <w:spacing w:line="240" w:lineRule="auto"/>
+      </w:pPr>
+    </w:p>
+    <w:p>
+      <w:pPr>
+        <w:spacing w:line="240" w:lineRule="auto"/>
+      </w:pPr>
+    </w:p>
+    <w:p>
+      <w:pPr>
+        <w:spacing w:line="240" w:lineRule="auto"/>
+      </w:pPr>
+    </w:p>
+    <w:p>
+      <w:pPr>
+        <w:spacing w:line="240" w:lineRule="auto"/>
+      </w:pPr>
+    </w:p>
+    <w:p>
+      <w:pPr>
+        <w:spacing w:line="240" w:lineRule="auto"/>
+      </w:pPr>
+    </w:p>
+    <w:p>
+      <w:pPr>
+        <w:spacing w:line="240" w:lineRule="auto"/>
+      </w:pPr>
+    </w:p>
+    <w:p>
+      <w:pPr>
+        <w:spacing w:line="240" w:lineRule="auto"/>
+      </w:pPr>
+    </w:p>
+    <w:p>
+      <w:pPr>
+        <w:spacing w:line="240" w:lineRule="auto"/>
+      </w:pPr>
+    </w:p>
+    <w:p>
+      <w:pPr>
+        <w:spacing w:line="240" w:lineRule="auto"/>
+      </w:pPr>
+    </w:p>
+    <w:p>
+      <w:pPr>
+        <w:spacing w:line="240" w:lineRule="auto"/>
+      </w:pPr>
+    </w:p>
+    <w:p>
+      <w:pPr>
+        <w:spacing w:line="240" w:lineRule="auto"/>
+      </w:pPr>
+    </w:p>
+    <w:p>
+      <w:pPr>
+        <w:spacing w:line="240" w:lineRule="auto"/>
+      </w:pPr>
+    </w:p>
+    <w:p>
+      <w:pPr>
+        <w:spacing w:line="240" w:lineRule="auto"/>
+      </w:pPr>
+    </w:p>
+    <w:p>
+      <w:pPr>
+        <w:spacing w:line="240" w:lineRule="auto"/>
+      </w:pPr>
+    </w:p>
+    <w:p>
+      <w:pPr>
+        <w:spacing w:line="240" w:lineRule="auto"/>
+      </w:pPr>
+    </w:p>
+    <w:p>
+      <w:pPr>
+        <w:spacing w:line="240" w:lineRule="auto"/>
+      </w:pPr>
+    </w:p>
+    <w:p>
+      <w:pPr>
+        <w:spacing w:line="240" w:lineRule="auto"/>
+      </w:pPr>
+    </w:p>
+    <w:p>
+      <w:pPr>
+        <w:spacing w:line="240" w:lineRule="auto"/>
+      </w:pPr>
+    </w:p>
+    <w:p>
+      <w:pPr>
+        <w:spacing w:line="240" w:lineRule="auto"/>
+      </w:pPr>
     </w:p>
     <w:p>
       <w:pPr>

</xml_diff>

<commit_message>
Fix photo layout, labels, IP size, and signature spacing across all 6 templates
- Convert all photo anchors (wrapThrough floating) to wp:inline so labels
  flow directly below each photo in the text stream
- Add pageBreakBefore on each photo paragraph so each attachment starts on
  a new page (no more label-on-separate-page issue)
- Remove blank paragraphs that were between each floating image and its label
  (those blanks pushed labels off the page with the old floating layout)
- Enlarge all IP (passport) photo frames from ~2.9"x3.9" to 4.5"x6.0"
  to fill the pleading page better (agent/POA landscape frames unchanged)
- Fix signature spacing in 2ip_1agent: move blank row to before the JADE sig
  line so layout reads [blank] → [sig line] → [IP1NAME] rather than
  [sig line] → [blank] → [IP1NAME]
</commit_message>
<xml_diff>
--- a/poa_template_1ip_1agent.docx
+++ b/poa_template_1ip_1agent.docx
@@ -1415,6 +1415,8 @@
         <w:rPr>
           <w:noProof/>
         </w:rPr>
+        <w:jc w:val="center"/>
+        <w:pageBreakBefore/>
       </w:pPr>
       <w:r>
         <w:rPr>
@@ -1422,17 +1424,9 @@
         </w:rPr>
         <w:lastRenderedPageBreak/>
         <w:drawing>
-          <wp:anchor distT="0" distB="0" distL="114300" distR="114300" simplePos="0" relativeHeight="251658242" behindDoc="0" locked="0" layoutInCell="1" allowOverlap="1" wp14:anchorId="674738F6" wp14:editId="7867F415">
-            <wp:simplePos x="0" y="0"/>
-            <wp:positionH relativeFrom="column">
-              <wp:posOffset>245660</wp:posOffset>
-            </wp:positionH>
-            <wp:positionV relativeFrom="paragraph">
-              <wp:posOffset>199</wp:posOffset>
-            </wp:positionV>
+          <wp:inline distT="0" distB="0" distL="0" distR="0">
             <wp:extent cx="3714750" cy="2495550"/>
             <wp:effectExtent l="0" t="0" r="0" b="0"/>
-            <wp:wrapSquare wrapText="bothSides"/>
             <wp:docPr id="696357762" name="drawing" descr="A person's face on a passport&#10;&#10;AI-generated content may be incorrect."/>
             <wp:cNvGraphicFramePr>
               <a:graphicFrameLocks xmlns:a="http://schemas.openxmlformats.org/drawingml/2006/main" noChangeAspect="1"/>
@@ -1468,40 +1462,9 @@
                 </pic:pic>
               </a:graphicData>
             </a:graphic>
-          </wp:anchor>
+          </wp:inline>
         </w:drawing>
       </w:r>
-    </w:p>
-    <w:p/>
-    <w:p/>
-    <w:p>
-      <w:pPr>
-        <w:spacing w:line="240" w:lineRule="auto"/>
-        <w:rPr>
-          <w:noProof/>
-        </w:rPr>
-      </w:pPr>
-    </w:p>
-    <w:p>
-      <w:pPr>
-        <w:spacing w:line="240" w:lineRule="auto"/>
-        <w:rPr>
-          <w:noProof/>
-        </w:rPr>
-      </w:pPr>
-    </w:p>
-    <w:p>
-      <w:pPr>
-        <w:spacing w:line="240" w:lineRule="auto"/>
-      </w:pPr>
-    </w:p>
-    <w:p>
-      <w:pPr>
-        <w:spacing w:line="240" w:lineRule="auto"/>
-        <w:rPr>
-          <w:noProof/>
-        </w:rPr>
-      </w:pPr>
     </w:p>
     <w:p>
       <w:pPr>
@@ -1511,8 +1474,26 @@
           <w:noProof/>
           <w:sz w:val="24"/>
           <w:szCs w:val="24"/>
-        </w:rPr>
-      </w:pPr>
+          <w:lang w:eastAsia="zh-CN"/>
+        </w:rPr>
+      </w:pPr>
+      <w:r>
+        <w:rPr>
+          <w:noProof/>
+          <w:sz w:val="24"/>
+          <w:szCs w:val="24"/>
+        </w:rPr>
+        <w:t>Power of Attorney</w:t>
+      </w:r>
+      <w:r>
+        <w:rPr>
+          <w:noProof/>
+          <w:sz w:val="24"/>
+          <w:szCs w:val="24"/>
+          <w:lang w:eastAsia="zh-CN"/>
+        </w:rPr>
+        <w:t xml:space="preserve"> </w:t>
+      </w:r>
     </w:p>
     <w:p>
       <w:pPr>
@@ -1522,6 +1503,7 @@
           <w:noProof/>
           <w:sz w:val="24"/>
           <w:szCs w:val="24"/>
+          <w:lang w:eastAsia="zh-CN"/>
         </w:rPr>
       </w:pPr>
     </w:p>
@@ -1533,132 +1515,19 @@
           <w:noProof/>
           <w:sz w:val="24"/>
           <w:szCs w:val="24"/>
-        </w:rPr>
-      </w:pPr>
-    </w:p>
-    <w:p>
-      <w:pPr>
-        <w:spacing w:line="240" w:lineRule="auto"/>
-        <w:ind w:firstLine="720"/>
+          <w:lang w:eastAsia="zh-CN"/>
+        </w:rPr>
+        <w:jc w:val="center"/>
+        <w:pageBreakBefore/>
+      </w:pPr>
+      <w:r>
         <w:rPr>
           <w:noProof/>
-          <w:sz w:val="24"/>
-          <w:szCs w:val="24"/>
-        </w:rPr>
-      </w:pPr>
-    </w:p>
-    <w:p>
-      <w:pPr>
-        <w:spacing w:line="240" w:lineRule="auto"/>
-        <w:ind w:firstLine="720"/>
-        <w:rPr>
-          <w:noProof/>
-          <w:sz w:val="24"/>
-          <w:szCs w:val="24"/>
-        </w:rPr>
-      </w:pPr>
-    </w:p>
-    <w:p>
-      <w:pPr>
-        <w:spacing w:line="240" w:lineRule="auto"/>
-        <w:ind w:firstLine="720"/>
-        <w:rPr>
-          <w:noProof/>
-          <w:sz w:val="24"/>
-          <w:szCs w:val="24"/>
-        </w:rPr>
-      </w:pPr>
-    </w:p>
-    <w:p>
-      <w:pPr>
-        <w:spacing w:line="240" w:lineRule="auto"/>
-        <w:ind w:firstLine="720"/>
-        <w:rPr>
-          <w:noProof/>
-          <w:sz w:val="24"/>
-          <w:szCs w:val="24"/>
-        </w:rPr>
-      </w:pPr>
-    </w:p>
-    <w:p>
-      <w:pPr>
-        <w:spacing w:line="240" w:lineRule="auto"/>
-        <w:ind w:firstLine="720"/>
-        <w:rPr>
-          <w:noProof/>
-          <w:sz w:val="24"/>
-          <w:szCs w:val="24"/>
-        </w:rPr>
-      </w:pPr>
-    </w:p>
-    <w:p>
-      <w:pPr>
-        <w:spacing w:line="240" w:lineRule="auto"/>
-        <w:ind w:firstLine="720"/>
-        <w:rPr>
-          <w:noProof/>
-          <w:sz w:val="24"/>
-          <w:szCs w:val="24"/>
-          <w:lang w:eastAsia="zh-CN"/>
-        </w:rPr>
-      </w:pPr>
-      <w:r>
-        <w:rPr>
-          <w:noProof/>
-          <w:sz w:val="24"/>
-          <w:szCs w:val="24"/>
-        </w:rPr>
-        <w:t>Power of Attorney</w:t>
-      </w:r>
-      <w:r>
-        <w:rPr>
-          <w:noProof/>
-          <w:sz w:val="24"/>
-          <w:szCs w:val="24"/>
-          <w:lang w:eastAsia="zh-CN"/>
-        </w:rPr>
-        <w:t xml:space="preserve"> </w:t>
-      </w:r>
-    </w:p>
-    <w:p>
-      <w:pPr>
-        <w:spacing w:line="240" w:lineRule="auto"/>
-        <w:ind w:firstLine="720"/>
-        <w:rPr>
-          <w:noProof/>
-          <w:sz w:val="24"/>
-          <w:szCs w:val="24"/>
-          <w:lang w:eastAsia="zh-CN"/>
-        </w:rPr>
-      </w:pPr>
-    </w:p>
-    <w:p>
-      <w:pPr>
-        <w:spacing w:line="240" w:lineRule="auto"/>
-        <w:ind w:firstLine="720"/>
-        <w:rPr>
-          <w:noProof/>
-          <w:sz w:val="24"/>
-          <w:szCs w:val="24"/>
-          <w:lang w:eastAsia="zh-CN"/>
-        </w:rPr>
-      </w:pPr>
-      <w:r>
-        <w:rPr>
-          <w:noProof/>
         </w:rPr>
         <w:drawing>
-          <wp:anchor distT="0" distB="0" distL="114300" distR="114300" simplePos="0" relativeHeight="251658241" behindDoc="1" locked="0" layoutInCell="1" allowOverlap="1" wp14:anchorId="57BA200F" wp14:editId="67375C71">
-            <wp:simplePos x="0" y="0"/>
-            <wp:positionH relativeFrom="column">
-              <wp:posOffset>258445</wp:posOffset>
-            </wp:positionH>
-            <wp:positionV relativeFrom="paragraph">
-              <wp:posOffset>7620</wp:posOffset>
-            </wp:positionV>
-            <wp:extent cx="3589020" cy="4790440"/>
+          <wp:inline distT="0" distB="0" distL="0" distR="0">
+            <wp:extent cx="4115700" cy="5486400"/>
             <wp:effectExtent l="0" t="0" r="0" b="0"/>
-            <wp:wrapNone/>
             <wp:docPr id="1057359869" name="drawing"/>
             <wp:cNvGraphicFramePr>
               <a:graphicFrameLocks xmlns:a="http://schemas.openxmlformats.org/drawingml/2006/main" noChangeAspect="1"/>
@@ -1673,7 +1542,7 @@
                   <pic:blipFill>
                     <a:blip r:embed="rId9">
                       <a:extLst>
-                        <a:ext uri="{28A0092B-C50C-407E-A947-70E740481C1C}">
+                        <a:ext uri="{28A0092B-C50C-407E-A947-70E740481C1C}" cx="4115700" cy="5486400">
                           <a14:useLocalDpi xmlns:a14="http://schemas.microsoft.com/office/drawing/2010/main"/>
                         </a:ext>
                       </a:extLst>
@@ -1685,7 +1554,7 @@
                   <pic:spPr>
                     <a:xfrm>
                       <a:off x="0" y="0"/>
-                      <a:ext cx="3589020" cy="4790440"/>
+                      <a:ext cx="4115700" cy="5486400"/>
                     </a:xfrm>
                     <a:prstGeom prst="rect">
                       <a:avLst/>
@@ -1694,243 +1563,9 @@
                 </pic:pic>
               </a:graphicData>
             </a:graphic>
-            <wp14:sizeRelH relativeFrom="page">
-              <wp14:pctWidth>0</wp14:pctWidth>
-            </wp14:sizeRelH>
-            <wp14:sizeRelV relativeFrom="page">
-              <wp14:pctHeight>0</wp14:pctHeight>
-            </wp14:sizeRelV>
-          </wp:anchor>
+          </wp:inline>
         </w:drawing>
       </w:r>
-    </w:p>
-    <w:p>
-      <w:pPr>
-        <w:spacing w:line="240" w:lineRule="auto"/>
-        <w:ind w:firstLine="720"/>
-        <w:rPr>
-          <w:noProof/>
-          <w:sz w:val="24"/>
-          <w:szCs w:val="24"/>
-          <w:lang w:eastAsia="zh-CN"/>
-        </w:rPr>
-      </w:pPr>
-    </w:p>
-    <w:p>
-      <w:pPr>
-        <w:spacing w:line="240" w:lineRule="auto"/>
-        <w:ind w:firstLine="720"/>
-        <w:rPr>
-          <w:noProof/>
-          <w:sz w:val="24"/>
-          <w:szCs w:val="24"/>
-          <w:lang w:eastAsia="zh-CN"/>
-        </w:rPr>
-      </w:pPr>
-    </w:p>
-    <w:p>
-      <w:pPr>
-        <w:spacing w:line="240" w:lineRule="auto"/>
-        <w:ind w:firstLine="720"/>
-        <w:rPr>
-          <w:noProof/>
-          <w:sz w:val="24"/>
-          <w:szCs w:val="24"/>
-          <w:lang w:eastAsia="zh-CN"/>
-        </w:rPr>
-      </w:pPr>
-    </w:p>
-    <w:p>
-      <w:pPr>
-        <w:spacing w:line="240" w:lineRule="auto"/>
-        <w:ind w:firstLine="720"/>
-        <w:rPr>
-          <w:noProof/>
-          <w:sz w:val="24"/>
-          <w:szCs w:val="24"/>
-          <w:lang w:eastAsia="zh-CN"/>
-        </w:rPr>
-      </w:pPr>
-    </w:p>
-    <w:p>
-      <w:pPr>
-        <w:spacing w:line="240" w:lineRule="auto"/>
-        <w:ind w:firstLine="720"/>
-      </w:pPr>
-    </w:p>
-    <w:p>
-      <w:pPr>
-        <w:spacing w:line="240" w:lineRule="auto"/>
-        <w:ind w:firstLine="720"/>
-        <w:rPr>
-          <w:noProof/>
-          <w:sz w:val="24"/>
-          <w:szCs w:val="24"/>
-          <w:lang w:eastAsia="zh-CN"/>
-        </w:rPr>
-      </w:pPr>
-    </w:p>
-    <w:p>
-      <w:pPr>
-        <w:spacing w:line="240" w:lineRule="auto"/>
-        <w:ind w:firstLine="720"/>
-        <w:rPr>
-          <w:noProof/>
-          <w:sz w:val="24"/>
-          <w:szCs w:val="24"/>
-          <w:lang w:eastAsia="zh-CN"/>
-        </w:rPr>
-      </w:pPr>
-    </w:p>
-    <w:p>
-      <w:pPr>
-        <w:spacing w:line="240" w:lineRule="auto"/>
-        <w:rPr>
-          <w:noProof/>
-          <w:sz w:val="24"/>
-          <w:szCs w:val="24"/>
-          <w:lang w:eastAsia="zh-CN"/>
-        </w:rPr>
-      </w:pPr>
-    </w:p>
-    <w:p>
-      <w:pPr>
-        <w:spacing w:line="240" w:lineRule="auto"/>
-        <w:ind w:firstLine="720"/>
-        <w:rPr>
-          <w:noProof/>
-          <w:sz w:val="24"/>
-          <w:szCs w:val="24"/>
-          <w:lang w:eastAsia="zh-CN"/>
-        </w:rPr>
-      </w:pPr>
-    </w:p>
-    <w:p>
-      <w:pPr>
-        <w:spacing w:line="240" w:lineRule="auto"/>
-      </w:pPr>
-    </w:p>
-    <w:p>
-      <w:pPr>
-        <w:spacing w:line="240" w:lineRule="auto"/>
-        <w:ind w:firstLine="720"/>
-        <w:rPr>
-          <w:noProof/>
-          <w:sz w:val="24"/>
-          <w:szCs w:val="24"/>
-          <w:lang w:eastAsia="zh-CN"/>
-        </w:rPr>
-      </w:pPr>
-    </w:p>
-    <w:p>
-      <w:pPr>
-        <w:spacing w:line="240" w:lineRule="auto"/>
-      </w:pPr>
-    </w:p>
-    <w:p>
-      <w:pPr>
-        <w:spacing w:line="240" w:lineRule="auto"/>
-      </w:pPr>
-    </w:p>
-    <w:p>
-      <w:pPr>
-        <w:spacing w:line="240" w:lineRule="auto"/>
-      </w:pPr>
-    </w:p>
-    <w:p>
-      <w:pPr>
-        <w:spacing w:line="240" w:lineRule="auto"/>
-      </w:pPr>
-    </w:p>
-    <w:p>
-      <w:pPr>
-        <w:spacing w:line="240" w:lineRule="auto"/>
-      </w:pPr>
-    </w:p>
-    <w:p>
-      <w:pPr>
-        <w:spacing w:line="240" w:lineRule="auto"/>
-      </w:pPr>
-    </w:p>
-    <w:p>
-      <w:pPr>
-        <w:spacing w:line="240" w:lineRule="auto"/>
-      </w:pPr>
-    </w:p>
-    <w:p>
-      <w:pPr>
-        <w:spacing w:line="240" w:lineRule="auto"/>
-      </w:pPr>
-    </w:p>
-    <w:p>
-      <w:pPr>
-        <w:spacing w:line="240" w:lineRule="auto"/>
-      </w:pPr>
-    </w:p>
-    <w:p>
-      <w:pPr>
-        <w:spacing w:line="240" w:lineRule="auto"/>
-      </w:pPr>
-    </w:p>
-    <w:p>
-      <w:pPr>
-        <w:spacing w:line="240" w:lineRule="auto"/>
-      </w:pPr>
-    </w:p>
-    <w:p>
-      <w:pPr>
-        <w:spacing w:line="240" w:lineRule="auto"/>
-      </w:pPr>
-    </w:p>
-    <w:p>
-      <w:pPr>
-        <w:spacing w:line="240" w:lineRule="auto"/>
-      </w:pPr>
-    </w:p>
-    <w:p>
-      <w:pPr>
-        <w:spacing w:line="240" w:lineRule="auto"/>
-      </w:pPr>
-    </w:p>
-    <w:p>
-      <w:pPr>
-        <w:spacing w:line="240" w:lineRule="auto"/>
-      </w:pPr>
-    </w:p>
-    <w:p>
-      <w:pPr>
-        <w:spacing w:line="240" w:lineRule="auto"/>
-      </w:pPr>
-    </w:p>
-    <w:p>
-      <w:pPr>
-        <w:spacing w:line="240" w:lineRule="auto"/>
-      </w:pPr>
-    </w:p>
-    <w:p>
-      <w:pPr>
-        <w:spacing w:line="240" w:lineRule="auto"/>
-      </w:pPr>
-    </w:p>
-    <w:p>
-      <w:pPr>
-        <w:spacing w:line="240" w:lineRule="auto"/>
-      </w:pPr>
-    </w:p>
-    <w:p>
-      <w:pPr>
-        <w:spacing w:line="240" w:lineRule="auto"/>
-      </w:pPr>
-    </w:p>
-    <w:p>
-      <w:pPr>
-        <w:spacing w:line="240" w:lineRule="auto"/>
-      </w:pPr>
-    </w:p>
-    <w:p>
-      <w:pPr>
-        <w:spacing w:line="240" w:lineRule="auto"/>
-      </w:pPr>
     </w:p>
     <w:p>
       <w:pPr>

</xml_diff>